<commit_message>
6 states & yellow duty cycles added
</commit_message>
<xml_diff>
--- a/Lab1_TrafficLights/Team9_Lab1_Module4.docx
+++ b/Lab1_TrafficLights/Team9_Lab1_Module4.docx
@@ -10,6 +10,7 @@
           <w:bCs/>
           <w:i/>
           <w:iCs/>
+          <w:color w:val="1F3864" w:themeColor="accent1" w:themeShade="80"/>
           <w:sz w:val="44"/>
           <w:szCs w:val="44"/>
           <w:u w:val="single"/>
@@ -21,6 +22,7 @@
           <w:bCs/>
           <w:i/>
           <w:iCs/>
+          <w:color w:val="1F3864" w:themeColor="accent1" w:themeShade="80"/>
           <w:sz w:val="44"/>
           <w:szCs w:val="44"/>
           <w:u w:val="single"/>
@@ -33,6 +35,7 @@
           <w:bCs/>
           <w:i/>
           <w:iCs/>
+          <w:color w:val="1F3864" w:themeColor="accent1" w:themeShade="80"/>
           <w:sz w:val="44"/>
           <w:szCs w:val="44"/>
           <w:u w:val="single"/>
@@ -45,6 +48,7 @@
           <w:bCs/>
           <w:i/>
           <w:iCs/>
+          <w:color w:val="1F3864" w:themeColor="accent1" w:themeShade="80"/>
           <w:sz w:val="44"/>
           <w:szCs w:val="44"/>
           <w:u w:val="single"/>
@@ -57,6 +61,7 @@
           <w:bCs/>
           <w:i/>
           <w:iCs/>
+          <w:color w:val="1F3864" w:themeColor="accent1" w:themeShade="80"/>
           <w:sz w:val="44"/>
           <w:szCs w:val="44"/>
           <w:u w:val="single"/>
@@ -69,6 +74,7 @@
           <w:bCs/>
           <w:i/>
           <w:iCs/>
+          <w:color w:val="1F3864" w:themeColor="accent1" w:themeShade="80"/>
           <w:sz w:val="44"/>
           <w:szCs w:val="44"/>
           <w:u w:val="single"/>
@@ -150,7 +156,73 @@
         <w:t xml:space="preserve"> 2025</w:t>
       </w:r>
     </w:p>
-    <w:p/>
+    <w:p>
+      <w:r>
+        <w:rPr>
+          <w:noProof/>
+        </w:rPr>
+        <w:drawing>
+          <wp:anchor distT="0" distB="0" distL="114300" distR="114300" simplePos="0" relativeHeight="251771904" behindDoc="0" locked="0" layoutInCell="1" allowOverlap="1" wp14:anchorId="51F05FE2" wp14:editId="55F85E3A">
+            <wp:simplePos x="0" y="0"/>
+            <wp:positionH relativeFrom="margin">
+              <wp:align>center</wp:align>
+            </wp:positionH>
+            <wp:positionV relativeFrom="paragraph">
+              <wp:posOffset>3810</wp:posOffset>
+            </wp:positionV>
+            <wp:extent cx="4825725" cy="4617720"/>
+            <wp:effectExtent l="19050" t="19050" r="13335" b="11430"/>
+            <wp:wrapNone/>
+            <wp:docPr id="392278906" name="Imagen 1"/>
+            <wp:cNvGraphicFramePr>
+              <a:graphicFrameLocks xmlns:a="http://schemas.openxmlformats.org/drawingml/2006/main" noChangeAspect="1"/>
+            </wp:cNvGraphicFramePr>
+            <a:graphic xmlns:a="http://schemas.openxmlformats.org/drawingml/2006/main">
+              <a:graphicData uri="http://schemas.openxmlformats.org/drawingml/2006/picture">
+                <pic:pic xmlns:pic="http://schemas.openxmlformats.org/drawingml/2006/picture">
+                  <pic:nvPicPr>
+                    <pic:cNvPr id="392278906" name=""/>
+                    <pic:cNvPicPr/>
+                  </pic:nvPicPr>
+                  <pic:blipFill>
+                    <a:blip r:embed="rId11">
+                      <a:extLst>
+                        <a:ext uri="{28A0092B-C50C-407E-A947-70E740481C1C}">
+                          <a14:useLocalDpi xmlns:a14="http://schemas.microsoft.com/office/drawing/2010/main" val="0"/>
+                        </a:ext>
+                      </a:extLst>
+                    </a:blip>
+                    <a:stretch>
+                      <a:fillRect/>
+                    </a:stretch>
+                  </pic:blipFill>
+                  <pic:spPr>
+                    <a:xfrm>
+                      <a:off x="0" y="0"/>
+                      <a:ext cx="4825725" cy="4617720"/>
+                    </a:xfrm>
+                    <a:prstGeom prst="rect">
+                      <a:avLst/>
+                    </a:prstGeom>
+                    <a:ln>
+                      <a:solidFill>
+                        <a:schemeClr val="tx1"/>
+                      </a:solidFill>
+                    </a:ln>
+                  </pic:spPr>
+                </pic:pic>
+              </a:graphicData>
+            </a:graphic>
+            <wp14:sizeRelH relativeFrom="page">
+              <wp14:pctWidth>0</wp14:pctWidth>
+            </wp14:sizeRelH>
+            <wp14:sizeRelV relativeFrom="page">
+              <wp14:pctHeight>0</wp14:pctHeight>
+            </wp14:sizeRelV>
+          </wp:anchor>
+        </w:drawing>
+      </w:r>
+    </w:p>
     <w:p>
       <w:pPr>
         <w:pStyle w:val="Subttulo"/>
@@ -455,6 +527,7 @@
           <w:bCs/>
           <w:i/>
           <w:iCs/>
+          <w:color w:val="1F3864" w:themeColor="accent1" w:themeShade="80"/>
           <w:u w:val="single"/>
         </w:rPr>
       </w:pPr>
@@ -464,6 +537,7 @@
           <w:bCs/>
           <w:i/>
           <w:iCs/>
+          <w:color w:val="1F3864" w:themeColor="accent1" w:themeShade="80"/>
           <w:u w:val="single"/>
         </w:rPr>
         <w:t>Te</w:t>
@@ -474,6 +548,7 @@
           <w:bCs/>
           <w:i/>
           <w:iCs/>
+          <w:color w:val="1F3864" w:themeColor="accent1" w:themeShade="80"/>
           <w:u w:val="single"/>
         </w:rPr>
         <w:t>am</w:t>
@@ -484,6 +559,7 @@
           <w:bCs/>
           <w:i/>
           <w:iCs/>
+          <w:color w:val="1F3864" w:themeColor="accent1" w:themeShade="80"/>
           <w:u w:val="single"/>
         </w:rPr>
         <w:t>:</w:t>
@@ -494,6 +570,7 @@
           <w:bCs/>
           <w:i/>
           <w:iCs/>
+          <w:color w:val="1F3864" w:themeColor="accent1" w:themeShade="80"/>
           <w:u w:val="single"/>
         </w:rPr>
         <w:t xml:space="preserve"> </w:t>
@@ -504,6 +581,7 @@
           <w:bCs/>
           <w:i/>
           <w:iCs/>
+          <w:color w:val="1F3864" w:themeColor="accent1" w:themeShade="80"/>
           <w:u w:val="single"/>
         </w:rPr>
         <w:t>9</w:t>
@@ -516,12 +594,14 @@
         <w:rPr>
           <w:b/>
           <w:bCs/>
-        </w:rPr>
-      </w:pPr>
-      <w:r>
-        <w:rPr>
-          <w:b/>
-          <w:bCs/>
+          <w:color w:val="1F3864" w:themeColor="accent1" w:themeShade="80"/>
+        </w:rPr>
+      </w:pPr>
+      <w:r>
+        <w:rPr>
+          <w:b/>
+          <w:bCs/>
+          <w:color w:val="1F3864" w:themeColor="accent1" w:themeShade="80"/>
         </w:rPr>
         <w:lastRenderedPageBreak/>
         <w:t xml:space="preserve">Introduction </w:t>
@@ -646,7 +726,7 @@
                     <pic:cNvPicPr/>
                   </pic:nvPicPr>
                   <pic:blipFill>
-                    <a:blip r:embed="rId11">
+                    <a:blip r:embed="rId12">
                       <a:extLst>
                         <a:ext uri="{28A0092B-C50C-407E-A947-70E740481C1C}">
                           <a14:useLocalDpi xmlns:a14="http://schemas.microsoft.com/office/drawing/2010/main" val="0"/>
@@ -893,7 +973,7 @@
                     <pic:cNvPicPr/>
                   </pic:nvPicPr>
                   <pic:blipFill>
-                    <a:blip r:embed="rId12">
+                    <a:blip r:embed="rId13">
                       <a:extLst>
                         <a:ext uri="{28A0092B-C50C-407E-A947-70E740481C1C}">
                           <a14:useLocalDpi xmlns:a14="http://schemas.microsoft.com/office/drawing/2010/main" val="0"/>
@@ -1457,7 +1537,7 @@
                     <pic:cNvPicPr/>
                   </pic:nvPicPr>
                   <pic:blipFill>
-                    <a:blip r:embed="rId13">
+                    <a:blip r:embed="rId14">
                       <a:extLst>
                         <a:ext uri="{28A0092B-C50C-407E-A947-70E740481C1C}">
                           <a14:useLocalDpi xmlns:a14="http://schemas.microsoft.com/office/drawing/2010/main" val="0"/>
@@ -1974,7 +2054,7 @@
                     <pic:cNvPicPr/>
                   </pic:nvPicPr>
                   <pic:blipFill>
-                    <a:blip r:embed="rId14">
+                    <a:blip r:embed="rId15">
                       <a:extLst>
                         <a:ext uri="{28A0092B-C50C-407E-A947-70E740481C1C}">
                           <a14:useLocalDpi xmlns:a14="http://schemas.microsoft.com/office/drawing/2010/main" val="0"/>
@@ -2113,7 +2193,7 @@
                     <pic:cNvPicPr/>
                   </pic:nvPicPr>
                   <pic:blipFill>
-                    <a:blip r:embed="rId15">
+                    <a:blip r:embed="rId16">
                       <a:extLst>
                         <a:ext uri="{28A0092B-C50C-407E-A947-70E740481C1C}">
                           <a14:useLocalDpi xmlns:a14="http://schemas.microsoft.com/office/drawing/2010/main" val="0"/>
@@ -2372,7 +2452,7 @@
                     <pic:cNvPicPr/>
                   </pic:nvPicPr>
                   <pic:blipFill>
-                    <a:blip r:embed="rId16">
+                    <a:blip r:embed="rId17">
                       <a:extLst>
                         <a:ext uri="{28A0092B-C50C-407E-A947-70E740481C1C}">
                           <a14:useLocalDpi xmlns:a14="http://schemas.microsoft.com/office/drawing/2010/main" val="0"/>
@@ -2625,7 +2705,7 @@
                     <pic:cNvPicPr/>
                   </pic:nvPicPr>
                   <pic:blipFill>
-                    <a:blip r:embed="rId17">
+                    <a:blip r:embed="rId18">
                       <a:extLst>
                         <a:ext uri="{28A0092B-C50C-407E-A947-70E740481C1C}">
                           <a14:useLocalDpi xmlns:a14="http://schemas.microsoft.com/office/drawing/2010/main" val="0"/>
@@ -2886,7 +2966,7 @@
                     <pic:cNvPicPr/>
                   </pic:nvPicPr>
                   <pic:blipFill>
-                    <a:blip r:embed="rId18">
+                    <a:blip r:embed="rId19">
                       <a:extLst>
                         <a:ext uri="{28A0092B-C50C-407E-A947-70E740481C1C}">
                           <a14:useLocalDpi xmlns:a14="http://schemas.microsoft.com/office/drawing/2010/main" val="0"/>
@@ -3150,7 +3230,7 @@
                     <pic:cNvPicPr/>
                   </pic:nvPicPr>
                   <pic:blipFill>
-                    <a:blip r:embed="rId19">
+                    <a:blip r:embed="rId20">
                       <a:extLst>
                         <a:ext uri="{28A0092B-C50C-407E-A947-70E740481C1C}">
                           <a14:useLocalDpi xmlns:a14="http://schemas.microsoft.com/office/drawing/2010/main" val="0"/>
@@ -3250,7 +3330,7 @@
                     <pic:cNvPicPr/>
                   </pic:nvPicPr>
                   <pic:blipFill>
-                    <a:blip r:embed="rId20">
+                    <a:blip r:embed="rId21">
                       <a:extLst>
                         <a:ext uri="{28A0092B-C50C-407E-A947-70E740481C1C}">
                           <a14:useLocalDpi xmlns:a14="http://schemas.microsoft.com/office/drawing/2010/main" val="0"/>
@@ -3474,7 +3554,7 @@
                     <pic:cNvPicPr/>
                   </pic:nvPicPr>
                   <pic:blipFill>
-                    <a:blip r:embed="rId21">
+                    <a:blip r:embed="rId22">
                       <a:extLst>
                         <a:ext uri="{28A0092B-C50C-407E-A947-70E740481C1C}">
                           <a14:useLocalDpi xmlns:a14="http://schemas.microsoft.com/office/drawing/2010/main" val="0"/>
@@ -3701,7 +3781,7 @@
                     <pic:cNvPicPr/>
                   </pic:nvPicPr>
                   <pic:blipFill>
-                    <a:blip r:embed="rId22">
+                    <a:blip r:embed="rId23">
                       <a:extLst>
                         <a:ext uri="{28A0092B-C50C-407E-A947-70E740481C1C}">
                           <a14:useLocalDpi xmlns:a14="http://schemas.microsoft.com/office/drawing/2010/main" val="0"/>
@@ -3766,7 +3846,7 @@
                     <pic:cNvPicPr/>
                   </pic:nvPicPr>
                   <pic:blipFill>
-                    <a:blip r:embed="rId23">
+                    <a:blip r:embed="rId24">
                       <a:extLst>
                         <a:ext uri="{28A0092B-C50C-407E-A947-70E740481C1C}">
                           <a14:useLocalDpi xmlns:a14="http://schemas.microsoft.com/office/drawing/2010/main" val="0"/>
@@ -4040,7 +4120,7 @@
                     <pic:cNvPicPr/>
                   </pic:nvPicPr>
                   <pic:blipFill>
-                    <a:blip r:embed="rId24" cstate="print">
+                    <a:blip r:embed="rId25" cstate="print">
                       <a:extLst>
                         <a:ext uri="{28A0092B-C50C-407E-A947-70E740481C1C}">
                           <a14:useLocalDpi xmlns:a14="http://schemas.microsoft.com/office/drawing/2010/main" val="0"/>
@@ -4473,7 +4553,7 @@
                     <pic:cNvPicPr/>
                   </pic:nvPicPr>
                   <pic:blipFill rotWithShape="1">
-                    <a:blip r:embed="rId25" cstate="print">
+                    <a:blip r:embed="rId26" cstate="print">
                       <a:extLst>
                         <a:ext uri="{28A0092B-C50C-407E-A947-70E740481C1C}">
                           <a14:useLocalDpi xmlns:a14="http://schemas.microsoft.com/office/drawing/2010/main" val="0"/>
@@ -4809,7 +4889,7 @@
                     <pic:cNvPicPr/>
                   </pic:nvPicPr>
                   <pic:blipFill>
-                    <a:blip r:embed="rId26" cstate="print">
+                    <a:blip r:embed="rId27" cstate="print">
                       <a:extLst>
                         <a:ext uri="{28A0092B-C50C-407E-A947-70E740481C1C}">
                           <a14:useLocalDpi xmlns:a14="http://schemas.microsoft.com/office/drawing/2010/main" val="0"/>
@@ -5106,7 +5186,7 @@
                     <pic:cNvPicPr/>
                   </pic:nvPicPr>
                   <pic:blipFill>
-                    <a:blip r:embed="rId27" cstate="print">
+                    <a:blip r:embed="rId28" cstate="print">
                       <a:extLst>
                         <a:ext uri="{28A0092B-C50C-407E-A947-70E740481C1C}">
                           <a14:useLocalDpi xmlns:a14="http://schemas.microsoft.com/office/drawing/2010/main" val="0"/>
@@ -5300,7 +5380,7 @@
           <w:szCs w:val="28"/>
         </w:rPr>
       </w:pPr>
-      <w:hyperlink r:id="rId28" w:history="1">
+      <w:hyperlink r:id="rId29" w:history="1">
         <w:r>
           <w:rPr>
             <w:rStyle w:val="Hipervnculo"/>
@@ -5443,8 +5523,8 @@
       </w:r>
     </w:p>
     <w:sectPr>
-      <w:headerReference w:type="default" r:id="rId29"/>
-      <w:footerReference w:type="default" r:id="rId30"/>
+      <w:headerReference w:type="default" r:id="rId30"/>
+      <w:footerReference w:type="default" r:id="rId31"/>
       <w:pgSz w:w="12240" w:h="15840"/>
       <w:pgMar w:top="1440" w:right="1440" w:bottom="1440" w:left="1440" w:header="720" w:footer="720" w:gutter="0"/>
       <w:cols w:space="720"/>

</xml_diff>